<commit_message>
Update game documentation and add background image for levels
</commit_message>
<xml_diff>
--- a/DOCUMENTO DE CAMPO(videojuego).docx
+++ b/DOCUMENTO DE CAMPO(videojuego).docx
@@ -156,6 +156,74 @@
           <w:lang w:val="es-ES"/>
         </w:rPr>
         <w:t>Le agregamos un audio a la introducción.</w:t>
+      </w:r>
+    </w:p>
+    <w:p>
+      <w:pPr>
+        <w:pStyle w:val="Normal"/>
+        <w:spacing w:before="0" w:after="160"/>
+        <w:rPr>
+          <w:lang w:val="es-ES"/>
+        </w:rPr>
+      </w:pPr>
+      <w:r>
+        <w:rPr>
+          <w:b/>
+          <w:bCs/>
+          <w:u w:val="single"/>
+          <w:lang w:val="es-ES"/>
+        </w:rPr>
+        <w:t>SEMANA 7:</w:t>
+      </w:r>
+      <w:r>
+        <w:rPr>
+          <w:b/>
+          <w:bCs/>
+          <w:lang w:val="es-ES"/>
+        </w:rPr>
+        <w:t xml:space="preserve"> </w:t>
+      </w:r>
+      <w:r>
+        <w:rPr>
+          <w:lang w:val="es-ES"/>
+        </w:rPr>
+        <w:t>Se colocó una música de fondo, y los pasos para el jugador.</w:t>
+      </w:r>
+    </w:p>
+    <w:p>
+      <w:pPr>
+        <w:pStyle w:val="Normal"/>
+        <w:spacing w:before="0" w:after="160"/>
+        <w:rPr>
+          <w:lang w:val="es-ES"/>
+        </w:rPr>
+      </w:pPr>
+      <w:r>
+        <w:rPr>
+          <w:b/>
+          <w:bCs/>
+          <w:u w:val="single"/>
+          <w:lang w:val="es-ES"/>
+        </w:rPr>
+        <w:t>SEMANA 8:</w:t>
+      </w:r>
+      <w:r>
+        <w:rPr>
+          <w:lang w:val="es-ES"/>
+        </w:rPr>
+        <w:t xml:space="preserve"> Se diseñó el nivel 1 y 2.</w:t>
+      </w:r>
+    </w:p>
+    <w:p>
+      <w:pPr>
+        <w:pStyle w:val="Normal"/>
+        <w:spacing w:before="0" w:after="160"/>
+        <w:rPr>
+          <w:lang w:val="es-ES"/>
+        </w:rPr>
+      </w:pPr>
+      <w:r>
+        <w:rPr/>
       </w:r>
     </w:p>
     <w:sectPr>
@@ -571,6 +639,7 @@
     <w:qFormat/>
     <w:pPr>
       <w:widowControl/>
+      <w:suppressAutoHyphens w:val="true"/>
       <w:bidi w:val="0"/>
       <w:spacing w:lineRule="auto" w:line="259" w:before="0" w:after="160"/>
       <w:jc w:val="left"/>

</xml_diff>